<commit_message>
Update repository link in design doc and add Python script
</commit_message>
<xml_diff>
--- a/ProgrammingExercise2/NateLawonn_ProgrammingExercise_2.docx
+++ b/ProgrammingExercise2/NateLawonn_ProgrammingExercise_2.docx
@@ -345,16 +345,18 @@
           <w:rPr>
             <w:rStyle w:val="Hyperlink"/>
           </w:rPr>
-          <w:t>https://github.com/nlawonn/ProgrammingConcepts2</w:t>
+          <w:t>https://github.com/nlawonn/ProgrammingConcepts2/tree/master/ProgrammingExercise2</w:t>
         </w:r>
       </w:hyperlink>
       <w:r>
         <w:t xml:space="preserve"> </w:t>
       </w:r>
     </w:p>
-    <w:p/>
-    <w:p>
-      <w:r>
+    <w:p>
+      <w:r>
+        <w:rPr>
+          <w:noProof/>
+        </w:rPr>
         <w:drawing>
           <wp:inline distT="0" distB="0" distL="0" distR="0" wp14:anchorId="0323A2DC" wp14:editId="092B91B1">
             <wp:extent cx="5258534" cy="800212"/>
@@ -392,6 +394,9 @@
         </w:drawing>
       </w:r>
       <w:r>
+        <w:rPr>
+          <w:noProof/>
+        </w:rPr>
         <w:drawing>
           <wp:inline distT="0" distB="0" distL="0" distR="0" wp14:anchorId="7E90D89D" wp14:editId="15D2F75F">
             <wp:extent cx="5410955" cy="1009791"/>
@@ -431,6 +436,9 @@
     </w:p>
     <w:p>
       <w:r>
+        <w:rPr>
+          <w:noProof/>
+        </w:rPr>
         <w:drawing>
           <wp:inline distT="0" distB="0" distL="0" distR="0" wp14:anchorId="2CFC3B73" wp14:editId="5AE2BF87">
             <wp:extent cx="5943600" cy="683895"/>
@@ -468,6 +476,9 @@
         </w:drawing>
       </w:r>
       <w:r>
+        <w:rPr>
+          <w:noProof/>
+        </w:rPr>
         <w:drawing>
           <wp:inline distT="0" distB="0" distL="0" distR="0" wp14:anchorId="7354F929" wp14:editId="66B256C1">
             <wp:extent cx="5943600" cy="697230"/>

</xml_diff>